<commit_message>
penultima repasada, listas desplegables para las categorias, dictado por voz
</commit_message>
<xml_diff>
--- a/docs/capitulos_tt2/06_cap6_construccion.docx
+++ b/docs/capitulos_tt2/06_cap6_construccion.docx
@@ -295,7 +295,7 @@
         <w:jc w:val="both"/>
       </w:pPr>
       <w:r>
-        <w:t xml:space="preserve">Las categorías (bebidas, lácteos, botanas, etcétera) sirven para ordenar el catálogo y filtrar. Los proveedores se registran con su nombre, teléfono y correo, y se les asignan las categorías que surten. Un producto puede ligarse a un proveedor, y de esa forma el tendero sabe a quién llamar cuando algo está en rojo. Para que nadie empiece desde cero, el sistema trae cargadas 20 categorías de productos, un catálogo de 186 productos de abarrotes con su ícono y precio sugerido, y, para cada tienda nueva, 24 proveedores comunes (Coca-Cola FEMSA, Bimbo, Lala, Sabritas, Procter &amp; Gamble, entre otros, ya ligados a las categorías que surten) y 19 categorías de gastos, cada una marcada como fija o variable para que al elegirla se proponga el tipo de gasto.</w:t>
+        <w:t xml:space="preserve">Las categorías (bebidas, lácteos, botanas, etcétera) sirven para ordenar el catálogo y filtrar. Los proveedores se registran con su nombre, teléfono y correo, y se les asignan las categorías que surten. Un producto puede ligarse a un proveedor, y de esa forma el tendero sabe a quién llamar cuando algo está en rojo. Para que nadie empiece desde cero, el sistema trae cargadas 20 categorías de productos, un catálogo de 186 productos de abarrotes con su ícono y precio sugerido, y, para cada tienda nueva, 24 proveedores comunes (Coca-Cola FEMSA, Bimbo, Lala, Sabritas, Procter &amp; Gamble, entre otros, ya ligados a las categorías que surten) y 19 categorías de gastos, cada una marcada como fija o variable para que al elegirla se proponga el tipo de gasto. Como son muchas opciones, todas las listas largas (categorías, proveedores, íconos y categorías de gasto) se muestran recogidas con las tres primeras y un botón "Mostrar más"; lo que el tendero ya eligió siempre queda a la vista.</w:t>
       </w:r>
     </w:p>
     <w:p>
@@ -2770,7 +2770,7 @@
         <w:jc w:val="both"/>
       </w:pPr>
       <w:r>
-        <w:t xml:space="preserve">El tendero puede dictar sus mensajes con el micrófono. El botón funciona como el micrófono de un radio: se mantiene presionado mientras se habla, el texto va apareciendo en el cuadro del chat y al soltarlo se deja de escuchar. Esto usa la función de reconocimiento de voz del navegador [12], por lo que no tiene costo adicional, pero depende del navegador y, en algunos, de la conexión a internet. Funciona con el micrófono del equipo o con unos audífonos con micrófono.</w:t>
+        <w:t xml:space="preserve">El tendero puede dictar sus mensajes con el micrófono. El botón funciona como el micrófono de un radio: se mantiene presionado mientras se habla, el texto va apareciendo en el cuadro del chat y al soltarlo se deja de escuchar. Como el reconocimiento de voz es una función del navegador, solo está disponible en Chrome y Edge (Firefox no la incluye) y necesita internet; la primera vez se pide el permiso del micrófono aparte, para que el aviso del navegador no interrumpa el dictado. Esto usa la función de reconocimiento de voz del navegador [12], por lo que no tiene costo adicional, pero depende del navegador y, en algunos, de la conexión a internet. Funciona con el micrófono del equipo o con unos audífonos con micrófono.</w:t>
       </w:r>
     </w:p>
     <w:p>

</xml_diff>

<commit_message>
graficas reales (en rosa), reportes financieros, guia de colores y terminos condiciones
</commit_message>
<xml_diff>
--- a/docs/capitulos_tt2/06_cap6_construccion.docx
+++ b/docs/capitulos_tt2/06_cap6_construccion.docx
@@ -351,7 +351,7 @@
         <w:jc w:val="both"/>
       </w:pPr>
       <w:r>
-        <w:t xml:space="preserve">La pantalla de inicio muestra un resumen del mes con las ventas, la utilidad y el efectivo, y desde ahí se llega a las demás secciones. En el registro de gastos se capturan los gastos de la tienda, que pueden ser fijos (renta, luz) o variables (bolsas, flete), y se les puede asignar una categoría propia. Cada gasto lleva además el mes al que corresponde, que por defecto es el mes actual pero se puede cambiar: la luz de septiembre que se paga en octubre se registra como de septiembre, y los reportes la cuentan en ese mes. Así los números de cada mes reflejan lo que realmente se gastó en ese mes y no cuándo se capturó el recibo. Los reportes financieros se pueden ver de los últimos 1, 3, 6 o 12 meses, o de un rango de meses que escoge el tendero (hasta 24), con gráficas de ingresos y egresos y de la utilidad. El sistema recuerda el último periodo que se eligió. Debajo de las gráficas aparecen alertas y sugerencias concretas: un gasto mucho más alto de lo normal, los meses en que se perdió dinero, gastos que subieron más de 20 % contra el mes anterior, un margen operativo menor a 10 % y los productos de baja rotación. Además hay un reporte de ventas, con filtro por fechas, que muestra cuánto se vendió y se ganó, el ticket promedio, los productos que más se vendieron y los que más ganancia dejaron, las ventas por categoría y las ventas de cada día. También hay una sección de productos de baja rotación, que se carga por lotes, otra de punto de equilibrio, otra de precios sugeridos y la de pronóstico de ventas, que se explica en la sección 6.6. Tanto el inicio como los reportes tienen un botón que le pide a la IA una explicación de los números en palabras sencillas. Si hay ventas de productos sin precio de compra, la pantalla lo avisa, porque en ese caso la utilidad se ve más alta de lo real.</w:t>
+        <w:t xml:space="preserve">La pantalla de inicio muestra un resumen del mes con las ventas, la utilidad y el efectivo, y desde ahí se llega a las demás secciones. Cada sección tiene en el inicio una tarjeta con una gráfica hecha con los datos reales de la tienda (la utilidad de los últimos seis meses, las ventas de las últimas ocho semanas, los gastos por mes, lo vendido en el mes contra la meta del punto de equilibrio y el margen de los productos más vendidos). Todas las gráficas del módulo son rosas y se dibujan en el navegador con SVG a partir de los datos que manda el servidor; cada una tiene un icono de ojo que la abre en una ventana grande, con ejes, valores y, cuando son pocos datos, una tabla con los números exactos. En el registro de gastos se capturan los gastos de la tienda, que pueden ser fijos (renta, luz) o variables (bolsas, flete), y se les puede asignar una categoría propia. Cada gasto lleva además el mes al que corresponde, que por defecto es el mes actual pero se puede cambiar: la luz de septiembre que se paga en octubre se registra como de septiembre, y los reportes la cuentan en ese mes. Así los números de cada mes reflejan lo que realmente se gastó en ese mes y no cuándo se capturó el recibo. Los reportes financieros se pueden ver de los últimos 1, 3, 6 o 12 meses, o de un rango de meses que escoge el tendero (hasta 24), con gráficas de ingresos y egresos y de la utilidad. El sistema recuerda el último periodo que se eligió. Debajo de las gráficas aparecen alertas y sugerencias concretas: un gasto mucho más alto de lo normal, los meses en que se perdió dinero, gastos que subieron más de 20 % contra el mes anterior, un margen operativo menor a 10 % y los productos de baja rotación. Además hay un reporte de ventas, con filtro por fechas, que muestra cuánto se vendió y se ganó, el ticket promedio, los productos que más se vendieron y los que más ganancia dejaron, las ventas por categoría y las ventas de cada día. También hay una sección de productos de baja rotación, que se carga por lotes, otra de punto de equilibrio, otra de precios sugeridos y la de pronóstico de ventas, que se explica en la sección 6.6. Tanto el inicio como los reportes tienen un botón que le pide a la IA una explicación de los números en palabras sencillas. Si hay ventas de productos sin precio de compra, la pantalla lo avisa, porque en ese caso la utilidad se ve más alta de lo real.</w:t>
       </w:r>
     </w:p>
     <w:p>
@@ -2821,7 +2821,7 @@
         <w:jc w:val="both"/>
       </w:pPr>
       <w:r>
-        <w:t xml:space="preserve">Para entrar al sistema hay que iniciar sesión con el teléfono o el correo y una contraseña, y todas las pantallas están protegidas: sin sesión no se ve nada. Las contraseñas no se guardan tal cual, sino que Django las convierte con un algoritmo de cifrado de un solo sentido y con un valor aleatorio distinto para cada usuario [4]. Cada formulario y cada petición del navegador lleva un código de seguridad que impide que otro sitio mande acciones en nombre del usuario, y las cookies de la sesión no pueden ser leídas por scripts del navegador. Además, todas las consultas filtran por tienda, de manera que un negocio nunca ve los datos de otro. El usuario puede eliminar su cuenta y sus datos desde el menú.</w:t>
+        <w:t xml:space="preserve">Para entrar al sistema hay que iniciar sesión con el teléfono o el correo y una contraseña, y todas las pantallas están protegidas: sin sesión no se ve nada. Para crear la cuenta hay que aceptar los términos y condiciones y el aviso de protección de datos, que se pueden leer sin iniciar sesión, y el sistema guarda la fecha de aceptación. Ese texto aclara que marIA es un prototipo académico y que, por eso, sus referentes de seguridad (ISO/IEC 27001, TLS 1.3, AES-256, OAuth 2.0) y de protección de datos (LFPDPPP) se proyectan para un despliegue futuro y no están todos implementados hoy. Las contraseñas no se guardan tal cual, sino que Django las convierte con un algoritmo de cifrado de un solo sentido y con un valor aleatorio distinto para cada usuario [4]. Cada formulario y cada petición del navegador lleva un código de seguridad que impide que otro sitio mande acciones en nombre del usuario, y las cookies de la sesión no pueden ser leídas por scripts del navegador. Además, todas las consultas filtran por tienda, de manera que un negocio nunca ve los datos de otro. El usuario puede eliminar su cuenta y sus datos desde el menú.</w:t>
       </w:r>
     </w:p>
     <w:p>
@@ -3391,7 +3391,7 @@
         <w:jc w:val="both"/>
       </w:pPr>
       <w:r>
-        <w:t xml:space="preserve">El color principal de las pestañas y los botones cambia según el módulo en el que está el tendero, por lo que saber en qué parte del sistema se encuentra le toma un segundo. La interfaz se adapta al tamaño de la pantalla, para poderse usar desde una computadora, una tableta o un celular.</w:t>
+        <w:t xml:space="preserve">El color principal de las pestañas y los botones cambia según el módulo en el que está el tendero, por lo que saber en qué parte del sistema se encuentra le toma un segundo. Para que el significado no se quede a la intuición, la primera vez que entra se muestra una ventana con la guía de colores, que también aparece en la pantalla de inicio de sesión y en la ayuda. La interfaz se adapta al tamaño de la pantalla, para poderse usar desde una computadora, una tableta o un celular.</w:t>
       </w:r>
     </w:p>
     <w:p>

</xml_diff>